<commit_message>
amir exir cv 20
</commit_message>
<xml_diff>
--- a/amirexir_CV19.docx
+++ b/amirexir_CV19.docx
@@ -72,29 +72,7 @@
           <w:sz w:val="28"/>
           <w:szCs w:val="28"/>
         </w:rPr>
-        <w:t xml:space="preserve">Seyed Amirhossein </w:t>
-      </w:r>
-      <w:proofErr w:type="spellStart"/>
-      <w:r>
-        <w:rPr>
-          <w:rFonts w:ascii="Times New Roman" w:hAnsi="Times New Roman" w:cs="Times New Roman"/>
-          <w:b/>
-          <w:bCs/>
-          <w:sz w:val="28"/>
-          <w:szCs w:val="28"/>
-        </w:rPr>
-        <w:t>Eksir</w:t>
-      </w:r>
-      <w:proofErr w:type="spellEnd"/>
-      <w:r>
-        <w:rPr>
-          <w:rFonts w:ascii="Times New Roman" w:hAnsi="Times New Roman" w:cs="Times New Roman"/>
-          <w:b/>
-          <w:bCs/>
-          <w:sz w:val="28"/>
-          <w:szCs w:val="28"/>
-        </w:rPr>
-        <w:t xml:space="preserve"> Monfared</w:t>
+        <w:t>Seyed Amirhossein Eksir Monfared</w:t>
       </w:r>
       <w:r>
         <w:rPr>
@@ -6959,13 +6937,227 @@
     </w:p>
     <w:p>
       <w:pPr>
+        <w:widowControl/>
+        <w:autoSpaceDE/>
+        <w:autoSpaceDN/>
+        <w:spacing w:before="100" w:beforeAutospacing="1" w:after="100" w:afterAutospacing="1"/>
+        <w:rPr>
+          <w:rFonts w:ascii="Times New Roman" w:eastAsia="Times New Roman" w:hAnsi="Times New Roman" w:cs="Times New Roman"/>
+          <w:sz w:val="24"/>
+          <w:szCs w:val="24"/>
+        </w:rPr>
+      </w:pPr>
+      <w:hyperlink r:id="rId14" w:history="1">
+        <w:r>
+          <w:rPr>
+            <w:rStyle w:val="Hyperlink"/>
+            <w:rFonts w:ascii="Times New Roman" w:eastAsia="Times New Roman" w:hAnsi="Times New Roman" w:cs="Times New Roman"/>
+            <w:sz w:val="24"/>
+            <w:szCs w:val="24"/>
+          </w:rPr>
+          <w:t>ERCOT Grid Analytics &amp; Forecasting Dashboar</w:t>
+        </w:r>
+        <w:r>
+          <w:rPr>
+            <w:rStyle w:val="Hyperlink"/>
+            <w:rFonts w:ascii="Times New Roman" w:eastAsia="Times New Roman" w:hAnsi="Times New Roman" w:cs="Times New Roman"/>
+            <w:sz w:val="24"/>
+            <w:szCs w:val="24"/>
+          </w:rPr>
+          <w:t>d</w:t>
+        </w:r>
+      </w:hyperlink>
+    </w:p>
+    <w:p>
+      <w:pPr>
+        <w:pStyle w:val="p1"/>
+        <w:rPr>
+          <w:rFonts w:ascii="Times New Roman" w:eastAsia="Segoe UI" w:hAnsi="Times New Roman"/>
+          <w:color w:val="auto"/>
+          <w:spacing w:val="-9"/>
+          <w:sz w:val="22"/>
+          <w:szCs w:val="22"/>
+        </w:rPr>
+      </w:pPr>
+      <w:r>
+        <w:rPr>
+          <w:rFonts w:ascii="Times New Roman" w:eastAsia="Segoe UI" w:hAnsi="Times New Roman"/>
+          <w:color w:val="auto"/>
+          <w:spacing w:val="-9"/>
+          <w:sz w:val="22"/>
+          <w:szCs w:val="22"/>
+        </w:rPr>
+        <w:t xml:space="preserve">-Designed and deployed a real-time ERCOT data analytics platform using </w:t>
+      </w:r>
+      <w:proofErr w:type="spellStart"/>
+      <w:r>
+        <w:rPr>
+          <w:rFonts w:ascii="Times New Roman" w:eastAsia="Segoe UI" w:hAnsi="Times New Roman"/>
+          <w:color w:val="auto"/>
+          <w:spacing w:val="-9"/>
+          <w:sz w:val="22"/>
+          <w:szCs w:val="22"/>
+        </w:rPr>
+        <w:t>Streamlit</w:t>
+      </w:r>
+      <w:proofErr w:type="spellEnd"/>
+      <w:r>
+        <w:rPr>
+          <w:rFonts w:ascii="Times New Roman" w:eastAsia="Segoe UI" w:hAnsi="Times New Roman"/>
+          <w:color w:val="auto"/>
+          <w:spacing w:val="-9"/>
+          <w:sz w:val="22"/>
+          <w:szCs w:val="22"/>
+        </w:rPr>
+        <w:t xml:space="preserve">, </w:t>
+      </w:r>
+      <w:proofErr w:type="spellStart"/>
+      <w:r>
+        <w:rPr>
+          <w:rFonts w:ascii="Times New Roman" w:eastAsia="Segoe UI" w:hAnsi="Times New Roman"/>
+          <w:color w:val="auto"/>
+          <w:spacing w:val="-9"/>
+          <w:sz w:val="22"/>
+          <w:szCs w:val="22"/>
+        </w:rPr>
+        <w:t>Plotly</w:t>
+      </w:r>
+      <w:proofErr w:type="spellEnd"/>
+      <w:r>
+        <w:rPr>
+          <w:rFonts w:ascii="Times New Roman" w:eastAsia="Segoe UI" w:hAnsi="Times New Roman"/>
+          <w:color w:val="auto"/>
+          <w:spacing w:val="-9"/>
+          <w:sz w:val="22"/>
+          <w:szCs w:val="22"/>
+        </w:rPr>
+        <w:t>, and the ERCOT Public API to visualize system load, renewable generation, outages, and market prices.</w:t>
+      </w:r>
+    </w:p>
+    <w:p>
+      <w:pPr>
+        <w:pStyle w:val="p1"/>
+        <w:rPr>
+          <w:rFonts w:ascii="Times New Roman" w:eastAsia="Segoe UI" w:hAnsi="Times New Roman"/>
+          <w:color w:val="auto"/>
+          <w:spacing w:val="-9"/>
+          <w:sz w:val="22"/>
+          <w:szCs w:val="22"/>
+        </w:rPr>
+      </w:pPr>
+      <w:r>
+        <w:rPr>
+          <w:rFonts w:ascii="Times New Roman" w:eastAsia="Segoe UI" w:hAnsi="Times New Roman"/>
+          <w:color w:val="auto"/>
+          <w:spacing w:val="-9"/>
+          <w:sz w:val="22"/>
+          <w:szCs w:val="22"/>
+        </w:rPr>
+        <w:t>-Implemented OAuth2.0 authentication (B2C flow) with token management and smart caching to handle ERCOT’s API rate limits.</w:t>
+      </w:r>
+    </w:p>
+    <w:p>
+      <w:pPr>
+        <w:pStyle w:val="p1"/>
+        <w:rPr>
+          <w:rFonts w:ascii="Times New Roman" w:eastAsia="Segoe UI" w:hAnsi="Times New Roman"/>
+          <w:color w:val="auto"/>
+          <w:spacing w:val="-9"/>
+          <w:sz w:val="22"/>
+          <w:szCs w:val="22"/>
+        </w:rPr>
+      </w:pPr>
+      <w:r>
+        <w:rPr>
+          <w:rFonts w:ascii="Times New Roman" w:eastAsia="Segoe UI" w:hAnsi="Times New Roman"/>
+          <w:color w:val="auto"/>
+          <w:spacing w:val="-9"/>
+          <w:sz w:val="22"/>
+          <w:szCs w:val="22"/>
+        </w:rPr>
+        <w:t xml:space="preserve">-Built an </w:t>
+      </w:r>
+      <w:proofErr w:type="spellStart"/>
+      <w:r>
+        <w:rPr>
+          <w:rFonts w:ascii="Times New Roman" w:eastAsia="Segoe UI" w:hAnsi="Times New Roman"/>
+          <w:color w:val="auto"/>
+          <w:spacing w:val="-9"/>
+          <w:sz w:val="22"/>
+          <w:szCs w:val="22"/>
+        </w:rPr>
+        <w:t>XGBoost</w:t>
+      </w:r>
+      <w:proofErr w:type="spellEnd"/>
+      <w:r>
+        <w:rPr>
+          <w:rFonts w:ascii="Times New Roman" w:eastAsia="Segoe UI" w:hAnsi="Times New Roman"/>
+          <w:color w:val="auto"/>
+          <w:spacing w:val="-9"/>
+          <w:sz w:val="22"/>
+          <w:szCs w:val="22"/>
+        </w:rPr>
+        <w:t>-based load forecasting engine with time-series feature engineering (lags, rolling averages, cyclical encoding) and interactive hyperparameter tuning via sidebar controls.</w:t>
+      </w:r>
+    </w:p>
+    <w:p>
+      <w:pPr>
+        <w:pStyle w:val="p1"/>
+        <w:rPr>
+          <w:rFonts w:ascii="Times New Roman" w:eastAsia="Segoe UI" w:hAnsi="Times New Roman"/>
+          <w:color w:val="auto"/>
+          <w:spacing w:val="-9"/>
+          <w:sz w:val="22"/>
+          <w:szCs w:val="22"/>
+        </w:rPr>
+      </w:pPr>
+      <w:r>
+        <w:rPr>
+          <w:rFonts w:ascii="Times New Roman" w:eastAsia="Segoe UI" w:hAnsi="Times New Roman"/>
+          <w:color w:val="auto"/>
+          <w:spacing w:val="-9"/>
+          <w:sz w:val="22"/>
+          <w:szCs w:val="22"/>
+        </w:rPr>
+        <w:t xml:space="preserve">-Added automatic train/test split validation with MAE, RMSE, and R² performance metrics, and dynamic </w:t>
+      </w:r>
+      <w:proofErr w:type="spellStart"/>
+      <w:r>
+        <w:rPr>
+          <w:rFonts w:ascii="Times New Roman" w:eastAsia="Segoe UI" w:hAnsi="Times New Roman"/>
+          <w:color w:val="auto"/>
+          <w:spacing w:val="-9"/>
+          <w:sz w:val="22"/>
+          <w:szCs w:val="22"/>
+        </w:rPr>
+        <w:t>Plotly</w:t>
+      </w:r>
+      <w:proofErr w:type="spellEnd"/>
+      <w:r>
+        <w:rPr>
+          <w:rFonts w:ascii="Times New Roman" w:eastAsia="Segoe UI" w:hAnsi="Times New Roman"/>
+          <w:color w:val="auto"/>
+          <w:spacing w:val="-9"/>
+          <w:sz w:val="22"/>
+          <w:szCs w:val="22"/>
+        </w:rPr>
+        <w:t xml:space="preserve"> diagnostics comparing actual vs forecasted loads.</w:t>
+      </w:r>
+    </w:p>
+    <w:p>
+      <w:pPr>
+        <w:pStyle w:val="p1"/>
+      </w:pPr>
+    </w:p>
+    <w:p>
+      <w:pPr>
         <w:spacing w:before="35" w:line="350" w:lineRule="exact"/>
         <w:rPr>
           <w:rStyle w:val="Heading2Char"/>
           <w:rFonts w:ascii="Times New Roman" w:hAnsi="Times New Roman" w:cs="Times New Roman"/>
         </w:rPr>
       </w:pPr>
-      <w:hyperlink r:id="rId14" w:history="1">
+      <w:hyperlink r:id="rId15" w:history="1">
         <w:r>
           <w:rPr>
             <w:rStyle w:val="Hyperlink"/>
@@ -6984,7 +7176,7 @@
         </w:rPr>
         <w:t xml:space="preserve">,  </w:t>
       </w:r>
-      <w:hyperlink r:id="rId15" w:history="1">
+      <w:hyperlink r:id="rId16" w:history="1">
         <w:r>
           <w:rPr>
             <w:rStyle w:val="Hyperlink"/>
@@ -7086,7 +7278,7 @@
           <w:rFonts w:ascii="Times New Roman" w:hAnsi="Times New Roman" w:cs="Times New Roman"/>
         </w:rPr>
       </w:pPr>
-      <w:hyperlink r:id="rId16" w:history="1">
+      <w:hyperlink r:id="rId17" w:history="1">
         <w:r>
           <w:rPr>
             <w:rStyle w:val="Hyperlink"/>
@@ -7202,7 +7394,7 @@
           <w:szCs w:val="24"/>
         </w:rPr>
       </w:pPr>
-      <w:hyperlink r:id="rId17" w:history="1">
+      <w:hyperlink r:id="rId18" w:history="1">
         <w:r>
           <w:rPr>
             <w:rStyle w:val="Hyperlink"/>
@@ -7383,7 +7575,7 @@
           <w:rFonts w:ascii="Times New Roman" w:eastAsia="Times New Roman" w:hAnsi="Times New Roman" w:cs="Times New Roman"/>
         </w:rPr>
       </w:pPr>
-      <w:hyperlink r:id="rId18" w:history="1">
+      <w:hyperlink r:id="rId19" w:history="1">
         <w:r>
           <w:rPr>
             <w:rStyle w:val="Hyperlink"/>
@@ -7457,12 +7649,25 @@
         <w:widowControl/>
         <w:autoSpaceDE/>
         <w:autoSpaceDN/>
+        <w:rPr>
+          <w:rFonts w:ascii=".AppleSystemUIFont" w:eastAsia="Times New Roman" w:hAnsi=".AppleSystemUIFont" w:cs="Times New Roman"/>
+          <w:color w:val="0E0E0E"/>
+          <w:sz w:val="21"/>
+          <w:szCs w:val="21"/>
+        </w:rPr>
+      </w:pPr>
+    </w:p>
+    <w:p>
+      <w:pPr>
+        <w:widowControl/>
+        <w:autoSpaceDE/>
+        <w:autoSpaceDN/>
         <w:spacing w:before="100" w:beforeAutospacing="1" w:after="100" w:afterAutospacing="1"/>
         <w:rPr>
           <w:rFonts w:ascii="Times New Roman" w:eastAsia="Times New Roman" w:hAnsi="Times New Roman" w:cs="Times New Roman"/>
         </w:rPr>
       </w:pPr>
-      <w:hyperlink r:id="rId19" w:history="1">
+      <w:hyperlink r:id="rId20" w:history="1">
         <w:proofErr w:type="spellStart"/>
         <w:r>
           <w:rPr>
@@ -7607,7 +7812,7 @@
           <w:rFonts w:ascii="Times New Roman" w:eastAsia="Times New Roman" w:hAnsi="Times New Roman" w:cs="Times New Roman"/>
         </w:rPr>
       </w:pPr>
-      <w:hyperlink r:id="rId20" w:history="1">
+      <w:hyperlink r:id="rId21" w:history="1">
         <w:r>
           <w:rPr>
             <w:rStyle w:val="Hyperlink"/>
@@ -7659,7 +7864,7 @@
         </w:rPr>
         <w:t xml:space="preserve"> that connects to the Alpaca Paper Trading API for simulated equity trades, real-time market data, and SMA crossover strategy visualization. Integrated daily AI-generated market summaries automatically pushed to GitHub and </w:t>
       </w:r>
-      <w:hyperlink r:id="rId21" w:history="1">
+      <w:hyperlink r:id="rId22" w:history="1">
         <w:r>
           <w:rPr>
             <w:rStyle w:val="Hyperlink"/>
@@ -8885,42 +9090,42 @@
         <v:path o:extrusionok="f" gradientshapeok="t" o:connecttype="rect"/>
         <o:lock v:ext="edit" aspectratio="t"/>
       </v:shapetype>
-      <v:shape id="_x0000_i1104" type="#_x0000_t75" style="width:42.25pt;height:42.25pt;visibility:visible;mso-wrap-style:square" o:bullet="t">
+      <v:shape id="_x0000_i1116" type="#_x0000_t75" style="width:42.05pt;height:42.05pt;visibility:visible;mso-wrap-style:square" o:bullet="t">
         <v:imagedata r:id="rId1" o:title=""/>
       </v:shape>
     </w:pict>
   </w:numPicBullet>
   <w:numPicBullet w:numPicBulletId="1">
     <w:pict>
-      <v:shape id="_x0000_i1105" type="#_x0000_t75" style="width:44.05pt;height:32.15pt;visibility:visible;mso-wrap-style:square" o:bullet="t">
+      <v:shape id="_x0000_i1117" type="#_x0000_t75" style="width:44.15pt;height:32.05pt;visibility:visible;mso-wrap-style:square" o:bullet="t">
         <v:imagedata r:id="rId2" o:title=""/>
       </v:shape>
     </w:pict>
   </w:numPicBullet>
   <w:numPicBullet w:numPicBulletId="2">
     <w:pict>
-      <v:shape id="_x0000_i1106" type="#_x0000_t75" alt="A picture containing application&#13;&#13;&#13;&#13;&#13;&#13;&#13;&#13;&#13;&#13;&#13;&#13;&#13;&#13;&#13;&#13;&#13;&#13;&#13;&#13;&#13;&#13;&#13;&#13;&#13;&#13;&#10;&#13;&#13;&#13;&#13;&#13;&#13;&#13;&#13;&#13;&#13;&#13;&#13;&#13;&#13;&#13;&#13;&#13;&#13;&#13;&#13;&#13;&#13;&#13;&#13;&#13;&#13;&#10;Description automatically generated" style="width:44.05pt;height:42.25pt;flip:y;visibility:visible;mso-wrap-style:square" o:bullet="t">
-        <v:imagedata r:id="rId3" o:title="A picture containing application&#13;&#13;&#13;&#13;&#13;&#13;&#13;&#13;&#13;&#13;&#13;&#13;&#13;&#13;&#13;&#13;&#13;&#13;&#13;&#13;&#13;&#13;&#13;&#13;&#13;&#13;&#10;&#13;&#13;&#13;&#13;&#13;&#13;&#13;&#13;&#13;&#13;&#13;&#13;&#13;&#13;&#13;&#13;&#13;&#13;&#13;&#13;&#13;&#13;&#13;&#13;&#13;&#13;&#10;Description automatically generated"/>
+      <v:shape id="_x0000_i1118" type="#_x0000_t75" alt="A picture containing application&#13;&#13;&#13;&#13;&#13;&#13;&#13;&#13;&#13;&#13;&#13;&#13;&#13;&#13;&#13;&#13;&#13;&#13;&#13;&#13;&#13;&#13;&#13;&#13;&#13;&#13;&#13;&#10;&#13;&#13;&#13;&#13;&#13;&#13;&#13;&#13;&#13;&#13;&#13;&#13;&#13;&#13;&#13;&#13;&#13;&#13;&#13;&#13;&#13;&#13;&#13;&#13;&#13;&#13;&#13;&#10;Description automatically generated" style="width:44.15pt;height:42.05pt;flip:y;visibility:visible;mso-wrap-style:square" o:bullet="t">
+        <v:imagedata r:id="rId3" o:title="A picture containing application&#13;&#13;&#13;&#13;&#13;&#13;&#13;&#13;&#13;&#13;&#13;&#13;&#13;&#13;&#13;&#13;&#13;&#13;&#13;&#13;&#13;&#13;&#13;&#13;&#13;&#13;&#13;&#10;&#13;&#13;&#13;&#13;&#13;&#13;&#13;&#13;&#13;&#13;&#13;&#13;&#13;&#13;&#13;&#13;&#13;&#13;&#13;&#13;&#13;&#13;&#13;&#13;&#13;&#13;&#13;&#10;Description automatically generated"/>
       </v:shape>
     </w:pict>
   </w:numPicBullet>
   <w:numPicBullet w:numPicBulletId="3">
     <w:pict>
-      <v:shape id="_x0000_i1107" type="#_x0000_t75" style="width:27.95pt;height:26.8pt;visibility:visible;mso-wrap-style:square" o:bullet="t">
+      <v:shape id="_x0000_i1119" type="#_x0000_t75" style="width:27.85pt;height:26.8pt;visibility:visible;mso-wrap-style:square" o:bullet="t">
         <v:imagedata r:id="rId4" o:title=""/>
       </v:shape>
     </w:pict>
   </w:numPicBullet>
   <w:numPicBullet w:numPicBulletId="4">
     <w:pict>
-      <v:shape id="_x0000_i1108" type="#_x0000_t75" alt="A picture containing text&#13;&#13;&#13;&#13;&#13;&#13;&#13;&#13;&#13;&#13;&#13;&#13;&#13;&#13;&#13;&#13;&#13;&#13;&#13;&#13;&#13;&#13;&#13;&#13;&#13;&#10;&#13;&#13;&#13;&#13;&#13;&#13;&#13;&#13;&#13;&#13;&#13;&#13;&#13;&#13;&#13;&#13;&#13;&#13;&#13;&#13;&#13;&#13;&#13;&#13;&#13;&#10;Description automatically generated" style="width:54.75pt;height:54.75pt;visibility:visible;mso-wrap-style:square" o:bullet="t">
-        <v:imagedata r:id="rId5" o:title="A picture containing text&#13;&#13;&#13;&#13;&#13;&#13;&#13;&#13;&#13;&#13;&#13;&#13;&#13;&#13;&#13;&#13;&#13;&#13;&#13;&#13;&#13;&#13;&#13;&#13;&#13;&#10;&#13;&#13;&#13;&#13;&#13;&#13;&#13;&#13;&#13;&#13;&#13;&#13;&#13;&#13;&#13;&#13;&#13;&#13;&#13;&#13;&#13;&#13;&#13;&#13;&#13;&#10;Description automatically generated"/>
+      <v:shape id="_x0000_i1120" type="#_x0000_t75" alt="A picture containing text&#13;&#13;&#13;&#13;&#13;&#13;&#13;&#13;&#13;&#13;&#13;&#13;&#13;&#13;&#13;&#13;&#13;&#13;&#13;&#13;&#13;&#13;&#13;&#13;&#13;&#13;&#10;&#13;&#13;&#13;&#13;&#13;&#13;&#13;&#13;&#13;&#13;&#13;&#13;&#13;&#13;&#13;&#13;&#13;&#13;&#13;&#13;&#13;&#13;&#13;&#13;&#13;&#13;&#10;Description automatically generated" style="width:54.65pt;height:54.65pt;visibility:visible;mso-wrap-style:square" o:bullet="t">
+        <v:imagedata r:id="rId5" o:title="A picture containing text&#13;&#13;&#13;&#13;&#13;&#13;&#13;&#13;&#13;&#13;&#13;&#13;&#13;&#13;&#13;&#13;&#13;&#13;&#13;&#13;&#13;&#13;&#13;&#13;&#13;&#13;&#10;&#13;&#13;&#13;&#13;&#13;&#13;&#13;&#13;&#13;&#13;&#13;&#13;&#13;&#13;&#13;&#13;&#13;&#13;&#13;&#13;&#13;&#13;&#13;&#13;&#13;&#13;&#10;Description automatically generated"/>
       </v:shape>
     </w:pict>
   </w:numPicBullet>
   <w:numPicBullet w:numPicBulletId="5">
     <w:pict>
-      <v:shape id="_x0000_i1109" type="#_x0000_t75" style="width:11.9pt;height:14.3pt;visibility:visible;mso-wrap-style:square" o:bullet="t">
+      <v:shape id="_x0000_i1121" type="#_x0000_t75" style="width:12.1pt;height:14.2pt;visibility:visible;mso-wrap-style:square" o:bullet="t">
         <v:imagedata r:id="rId6" o:title=""/>
       </v:shape>
     </w:pict>

</xml_diff>